<commit_message>
fix(defense-ai-idea-contest): HWP 직접 편집본 철회, docx 로 확정
한글에서 열리지 않는 것이 확인되어 HWP 바이너리 주입 방식과 관련
스크립트를 제거하고, 원본 양식 사양을 그대로 반영한 docx 를 제출본으로 확정

- 분량 조정본(약 15% 축약) 내용을 docx 에 동기화 (content_gen.js 자동 생성)
- URL·DOI 포함 문단은 양쪽정렬 시 자간이 벌어져 왼쪽정렬로 자동 전환
- A4 5매 유지 확인
</commit_message>
<xml_diff>
--- a/defense-ai-idea-contest/2026년 제3차 국방AI 활용 아이디어 경연대회_공모기획서.docx
+++ b/defense-ai-idea-contest/2026년 제3차 국방AI 활용 아이디어 경연대회_공모기획서.docx
@@ -1982,7 +1982,7 @@
                 <w:sz w:val="22"/>
                 <w:szCs w:val="22"/>
               </w:rPr>
-              <w:t xml:space="preserve">이 구조는 통계로도 드러난다. 국방부가 기획재정부에 제시한 자료를 인용한 보도에 따르면 군의 음식물 쓰레기 처리비용은 2018년 약 103억 원에서 2023년 약 195억 원으로 늘었다(출처 5). 국정감사에 제출된 국방부 자료를 인용한 별도 보도는 장병 1인당 연간 배출량이 2017년 125kg에서 2021년 195kg으로 증가했고, 2020년을 기준으로 비교하면 장병 1인당 182kg으로 같은 해 국민 1인당 100kg의 약 1.8배였다고 전한다(출처 6). 병력이 감소하는 추세에서 1인당 배출량이 늘었다는 사실은, 문제의 원인이 급식의 질이 아니라 “얼마를 만들 것인가”를 정하는 절차 자체에 있음을 시사한다.</w:t>
+              <w:t xml:space="preserve">이 구조는 통계로도 드러난다. 국방부가 기획재정부에 제시한 자료를 인용한 보도에 따르면 군의 음식물 쓰레기 처리비용은 2018년 약 103억 원에서 2023년 약 195억 원으로 늘었다(출처 5). 국정감사 제출자료를 인용한 별도 보도는 장병 1인당 연간 배출량이 2017년 125kg에서 2021년 195kg으로 증가했고, 2020년 기준으로는 장병 182kg으로 같은 해 국민 1인당 100kg의 약 1.8배였다고 전한다(출처 6). 병력이 감소하는 추세에서 1인당 배출량이 늘었다는 사실은, 문제의 원인이 급식의 질이 아니라 “얼마를 만들 것인가”를 정하는 절차 자체에 있음을 시사한다.</w:t>
             </w:r>
           </w:p>
           <w:p>
@@ -2000,7 +2000,7 @@
                 <w:sz w:val="22"/>
                 <w:szCs w:val="22"/>
               </w:rPr>
-              <w:t xml:space="preserve">2026년 장병 기본급식비는 1인 1일 13,000원에서 14,000원으로 인상되었다(출처 7). 단가 인상이 급식 만족도로 이어지려면 투입 재원이 잔반으로 빠져나가는 경로를 함께 줄여야 한다.</w:t>
+              <w:t xml:space="preserve">2026년 기본급식비는 1인 1일 13,000원에서 14,000원으로 인상되었다(출처 7). 단가 인상이 급식 만족도로 이어지려면 투입 재원이 잔반으로 빠져나가는 경로를 함께 줄여야 한다. 한편 군 일부 제대에는 급식 자동 청구 체계가 도입되어 식수 인원을 파악하고 적정 식재료량을 예측함으로써 인력과 예산 낭비를 줄이고 있다(출처 8). 이 체계는 집계·예측 정확도를 높여 소요량의 점추정을 개선한다. 그러나 그 추정이 어느 범위로 빗나갈지, 그 불확실성 아래에서 결식위험을 어디까지 감수하며 얼마를 만들 것인지는 여전히 담당자 개인의 판단에 남아 있다.</w:t>
             </w:r>
           </w:p>
           <w:p>
@@ -2018,25 +2018,7 @@
                 <w:sz w:val="22"/>
                 <w:szCs w:val="22"/>
               </w:rPr>
-              <w:t xml:space="preserve">한편 군 일부 제대에는 급식 자동 청구 체계가 도입되어, 식수 인원을 파악하고 적정 식재료량을 예측함으로써 인력과 예산 낭비를 줄이는 것을 목적으로 운용되고 있다(출처 8). 이 체계는 집계와 예측의 정확도를 높여 소요량의 점추정을 개선한다. 그러나 그 추정이 어느 범위로 빗나갈지, 그 불확실성 아래에서 결식위험을 어느 수준까지 감수하며 얼마를 만들 것인지는 여전히 담당자 개인의 판단에 남아 있다.</w:t>
-            </w:r>
-          </w:p>
-          <w:p>
-            <w:pPr>
-              <w:spacing w:after="0" w:before="0" w:line="252"/>
-              <w:jc w:val="both"/>
-            </w:pPr>
-            <w:r>
-              <w:rPr>
-                <w:rFonts w:ascii="맑은 고딕" w:cs="맑은 고딕" w:eastAsia="맑은 고딕" w:hAnsi="맑은 고딕"/>
-                <w:b w:val="false"/>
-                <w:bCs w:val="false"/>
-                <w:i w:val="false"/>
-                <w:iCs w:val="false"/>
-                <w:sz w:val="22"/>
-                <w:szCs w:val="22"/>
-              </w:rPr>
-              <w:t xml:space="preserve">집단급식 선행연구는 식수 예측이 오랫동안 담당자의 경험칙에 의존해 왔으며 데이터 기반 예측이 정확도를 개선함을 보고한다(출처 1, 2). 예측을 재고·발주 결정으로 변환하는 비용최적화 이론은 1950년대 정립 이후 기계학습 예측과 결합되는 흐름으로 발전했다(출처 3, 4). 본 제안의 목적은 예측 정확도를 한 단계 더 높이는 데 있지 않다. 예측에 남는 불확실성을 확률분포로 드러내고, 결식위험의 허용 수준을 지휘관이 정하는 정책 수치로 노출시켜 통제 가능하게 만드는 데 있다.</w:t>
+              <w:t xml:space="preserve">집단급식 선행연구는 식수 예측이 오랫동안 경험칙에 의존해 왔으며 데이터 기반 예측이 정확도를 개선함을 보고한다(출처 1, 2). 예측을 재고·발주 결정으로 변환하는 비용최적화 이론은 1950년대 정립 이후 기계학습 예측과 결합되는 흐름으로 발전했다(출처 3, 4). 본 제안의 목적은 예측 정확도를 더 높이는 데 있지 않다. 예측에 남는 불확실성을 확률분포로 드러내고, 결식위험의 허용 수준을 지휘관이 정하는 정책 수치로 노출시켜 통제 가능하게 만드는 데 있다.</w:t>
             </w:r>
           </w:p>
         </w:tc>
@@ -2161,20 +2143,20 @@
           </w:p>
           <w:p>
             <w:pPr>
-              <w:spacing w:after="0" w:before="0" w:line="252"/>
-              <w:jc w:val="both"/>
-            </w:pPr>
-            <w:r>
-              <w:rPr>
-                <w:rFonts w:ascii="맑은 고딕" w:cs="맑은 고딕" w:eastAsia="맑은 고딕" w:hAnsi="맑은 고딕"/>
-                <w:b w:val="false"/>
-                <w:bCs w:val="false"/>
-                <w:i w:val="false"/>
-                <w:iCs w:val="false"/>
-                <w:sz w:val="22"/>
-                <w:szCs w:val="22"/>
-              </w:rPr>
-              <w:t xml:space="preserve">담당자는 권고량과 불확실성 구간, 산출 근거를 확인해 조정·승인하며 당일 실적은 재학습에 환류된다. 폐쇄망 온프레미스에서 CPU만으로 구동되고 신규 하드웨어 도입이 없다. 급식 자동 청구 체계가 운용 중인 부대라면 그 체계가 표준화한 집계값을 예측 계층의 입력으로 그대로 활용한다.</w:t>
+              <w:spacing w:after="30" w:before="0" w:line="252"/>
+              <w:jc w:val="both"/>
+            </w:pPr>
+            <w:r>
+              <w:rPr>
+                <w:rFonts w:ascii="맑은 고딕" w:cs="맑은 고딕" w:eastAsia="맑은 고딕" w:hAnsi="맑은 고딕"/>
+                <w:b w:val="false"/>
+                <w:bCs w:val="false"/>
+                <w:i w:val="false"/>
+                <w:iCs w:val="false"/>
+                <w:sz w:val="22"/>
+                <w:szCs w:val="22"/>
+              </w:rPr>
+              <w:t xml:space="preserve">담당자는 권고량과 불확실성 구간, 산출 근거를 확인해 조정·승인하며 당일 실적은 재학습에 환류된다. 폐쇄망 온프레미스에서 CPU만으로 구동되고 신규 하드웨어 도입이 없다. 자동 청구 체계가 운용 중인 부대라면 그 체계가 표준화한 집계값을 예측 계층의 입력으로 그대로 활용한다.</w:t>
             </w:r>
           </w:p>
         </w:tc>
@@ -2374,7 +2356,7 @@
                 <w:sz w:val="22"/>
                 <w:szCs w:val="22"/>
               </w:rPr>
-              <w:t xml:space="preserve">· 선택 근거 — 분위수 회귀는 예측 오차의 비대칭 비용 구조를 손실함수 수준에서 직접 반영한다. 결식과 잔반의 비용이 서로 다른 본 문제에 구조적으로 부합하며, 변수 기여도 제시가 가능해 담당자에게 근거를 설명할 수 있다.</w:t>
+              <w:t xml:space="preserve">· 선택 근거 — 분위수 회귀는 예측 오차의 비대칭 비용 구조를 손실함수 수준에서 직접 반영한다. 결식과 잔반의 비용이 다른 본 문제에 구조적으로 부합하며, 변수 기여도 제시가 가능해 담당자에게 근거를 설명할 수 있다.</w:t>
             </w:r>
           </w:p>
           <w:p>
@@ -2447,7 +2429,7 @@
                 <w:sz w:val="22"/>
                 <w:szCs w:val="22"/>
               </w:rPr>
-              <w:t xml:space="preserve">본 제안은 방향을 뒤집는다. 지휘관이 결식 허용확률 α를 정책값으로 선언하면 서비스수준은 τ = 1 − α로 곧바로 정해지고, 권고 취사량은 예측분포의 τ분위가 된다. 시스템은 역으로 그 α가 함의하는 Cu/Co 비율(= τ/(1−τ))을 함께 표시해, 지휘관이 자신이 설정한 위험 수준의 의미를 수치로 확인하게 한다. 결식위험은 AI가 정하는 값이 아니라 지휘관이 정하고 AI가 이행·감시하는 값이 된다.</w:t>
+              <w:t xml:space="preserve">본 제안은 방향을 뒤집는다. 지휘관이 결식 허용확률 α를 정책값으로 선언하면 서비스수준은 τ = 1 − α로 정해지고, 권고 취사량은 예측분포의 τ분위가 된다. 시스템은 역으로 그 α가 함의하는 Cu/Co 비율(= τ/(1−τ))을 함께 표시해, 지휘관이 자신이 설정한 위험 수준의 의미를 수치로 확인하게 한다. 결식위험은 AI가 정하는 값이 아니라 지휘관이 정하고 AI가 이행·감시하는 값이 된다.</w:t>
             </w:r>
           </w:p>
           <w:p>
@@ -2484,7 +2466,7 @@
                 <w:sz w:val="22"/>
                 <w:szCs w:val="22"/>
               </w:rPr>
-              <w:t xml:space="preserve">① 전일 오후, 익일 3식 편차 예측 및 권고안 자동 생성</w:t>
+              <w:t xml:space="preserve">① 전일 오후 익일 3식 편차 예측 및 권고안 자동 생성 → ② 담당자가 권고량·불확실성 구간·산출 근거를 확인하고 필요 시 수정 후 승인(수정 시 사유 코드 선택)</w:t>
             </w:r>
           </w:p>
           <w:p>
@@ -2503,7 +2485,7 @@
                 <w:sz w:val="22"/>
                 <w:szCs w:val="22"/>
               </w:rPr>
-              <w:t xml:space="preserve">② 급양 담당자가 권고량·불확실성 구간·산출 근거를 확인하고 필요 시 수정 후 승인(수정 시 사유 코드 선택)</w:t>
+              <w:t xml:space="preserve">③ 승인값으로 취사·식자재 불출(자동 청구 체계 운용 부대는 청구값과 연동) → ④ 당일 실적(실취식 인원 또는 잔반 계측값) 입력 시 예측오차 자동 기록</w:t>
             </w:r>
           </w:p>
           <w:p>
@@ -2522,69 +2504,12 @@
                 <w:sz w:val="22"/>
                 <w:szCs w:val="22"/>
               </w:rPr>
-              <w:t xml:space="preserve">③ 승인값으로 취사 및 식자재 불출. 급식 자동 청구 체계 운용 부대는 그 청구값과 연동</w:t>
-            </w:r>
-          </w:p>
-          <w:p>
-            <w:pPr>
-              <w:spacing w:after="15" w:before="0" w:line="252"/>
-              <w:ind w:left="200" w:hanging="170"/>
-              <w:jc w:val="both"/>
-            </w:pPr>
-            <w:r>
-              <w:rPr>
-                <w:rFonts w:ascii="맑은 고딕" w:cs="맑은 고딕" w:eastAsia="맑은 고딕" w:hAnsi="맑은 고딕"/>
-                <w:b w:val="false"/>
-                <w:bCs w:val="false"/>
-                <w:i w:val="false"/>
-                <w:iCs w:val="false"/>
-                <w:sz w:val="22"/>
-                <w:szCs w:val="22"/>
-              </w:rPr>
-              <w:t xml:space="preserve">④ 당일 실적(실취식 인원 또는 잔반 계측값) 입력 시 예측오차 자동 기록</w:t>
-            </w:r>
-          </w:p>
-          <w:p>
-            <w:pPr>
-              <w:spacing w:after="15" w:before="0" w:line="252"/>
-              <w:ind w:left="200" w:hanging="170"/>
-              <w:jc w:val="both"/>
-            </w:pPr>
-            <w:r>
-              <w:rPr>
-                <w:rFonts w:ascii="맑은 고딕" w:cs="맑은 고딕" w:eastAsia="맑은 고딕" w:hAnsi="맑은 고딕"/>
-                <w:b w:val="false"/>
-                <w:bCs w:val="false"/>
-                <w:i w:val="false"/>
-                <w:iCs w:val="false"/>
-                <w:sz w:val="22"/>
-                <w:szCs w:val="22"/>
-              </w:rPr>
-              <w:t xml:space="preserve">⑤ 주 단위 재학습. 담당자 수정 이력은 모델 개선 신호로 별도 분석</w:t>
-            </w:r>
-          </w:p>
-          <w:p>
-            <w:pPr>
-              <w:spacing w:after="15" w:before="0" w:line="252"/>
-              <w:ind w:left="200" w:hanging="170"/>
-              <w:jc w:val="both"/>
-            </w:pPr>
-            <w:r>
-              <w:rPr>
-                <w:rFonts w:ascii="맑은 고딕" w:cs="맑은 고딕" w:eastAsia="맑은 고딕" w:hAnsi="맑은 고딕"/>
-                <w:b w:val="false"/>
-                <w:bCs w:val="false"/>
-                <w:i w:val="false"/>
-                <w:iCs w:val="false"/>
-                <w:sz w:val="22"/>
-                <w:szCs w:val="22"/>
-              </w:rPr>
-              <w:t xml:space="preserve">⑥ 지휘부는 부대별 결식 발생률, 실제 서비스수준 달성도, 잔반 추이를 대시보드로 확인</w:t>
-            </w:r>
-          </w:p>
-          <w:p>
-            <w:pPr>
-              <w:spacing w:after="0" w:before="0" w:line="252"/>
+              <w:t xml:space="preserve">⑤ 주 단위 재학습, 담당자 수정 이력은 모델 개선 신호로 분석 → ⑥ 지휘부는 부대별 결식 발생률·서비스수준 달성도·잔반 추이를 대시보드로 확인</w:t>
+            </w:r>
+          </w:p>
+          <w:p>
+            <w:pPr>
+              <w:spacing w:after="30" w:before="0" w:line="252"/>
               <w:jc w:val="both"/>
             </w:pPr>
             <w:r>
@@ -2715,25 +2640,7 @@
                 <w:sz w:val="22"/>
                 <w:szCs w:val="22"/>
               </w:rPr>
-              <w:t xml:space="preserve">기존 체계의 산출물은 소요량의 점추정이다. 점추정은 “얼마일 것 같다”까지만 말하고, 그 추정이 어느 범위로 빗나가는지, 어느 쪽으로 빗나가는 것이 더 위험한지는 말하지 않는다. 그 판단이 남는 한 담당자는 추정값 위에 경험적 여유분을 얹게 되며, 그 여유분은 근거도 기록도 남지 않는다.</w:t>
-            </w:r>
-          </w:p>
-          <w:p>
-            <w:pPr>
-              <w:spacing w:after="30" w:before="0" w:line="252"/>
-              <w:jc w:val="both"/>
-            </w:pPr>
-            <w:r>
-              <w:rPr>
-                <w:rFonts w:ascii="맑은 고딕" w:cs="맑은 고딕" w:eastAsia="맑은 고딕" w:hAnsi="맑은 고딕"/>
-                <w:b w:val="false"/>
-                <w:bCs w:val="false"/>
-                <w:i w:val="false"/>
-                <w:iCs w:val="false"/>
-                <w:sz w:val="22"/>
-                <w:szCs w:val="22"/>
-              </w:rPr>
-              <w:t xml:space="preserve">본 제안의 산출물은 편차의 확률분포와, 지휘관이 선언한 위험 허용 수준을 적용해 도출된 결정값이다. 여유분이 개인의 감각이 아니라 정책 수치에서 계산되고, 목표 위험과 실제 달성률이 매일 기록·검증된다. 두 체계는 경쟁 관계가 아니며, 자동 청구 체계가 표준화한 집계 데이터는 본 제안의 예측 계층에 가장 정제된 입력이 되므로 그 체계가 도입된 부대일수록 본 제안의 효과가 커진다.</w:t>
+              <w:t xml:space="preserve">기존 체계의 산출물은 소요량의 점추정이다. 점추정은 “얼마일 것 같다”까지만 말하고 그 추정이 어느 범위로, 어느 쪽으로 빗나가는지는 말하지 않는다. 그 판단이 남는 한 담당자는 추정값 위에 경험적 여유분을 얹게 되며 그 여유분은 근거도 기록도 남지 않는다. 본 제안의 산출물은 편차의 확률분포와, 지휘관이 선언한 위험 허용 수준을 적용해 도출된 결정값이다. 여유분이 감각이 아니라 정책 수치에서 계산되고 목표 위험과 실제 달성률이 매일 기록·검증된다. 두 체계는 경쟁 관계가 아니며, 자동 청구 체계가 표준화한 집계 데이터는 본 제안 예측 계층의 가장 정제된 입력이 되므로 그 체계가 도입된 부대일수록 효과가 커진다.</w:t>
             </w:r>
           </w:p>
           <w:p>
@@ -2769,7 +2676,7 @@
                 <w:sz w:val="22"/>
                 <w:szCs w:val="22"/>
               </w:rPr>
-              <w:t xml:space="preserve">민간 집단급식 분야에도 배식 이력과 메뉴 패턴을 학습해 권장 식수를 제시하는 예측 서비스가 존재한다(업계 일반 동향으로 서술하며 개별 제품의 1차 출처는 확인하지 못함 — 근거 미확보). 민간에서는 결식과 잔반의 손실이 모두 화폐로 환산되므로 기대비용 최소화가 성립한다. 군에서는 결식이 지휘 책임 사안이어서 화폐 환산이 어렵고, 이 비대칭 때문에 비용을 추정하는 대신 허용 위험을 선언하는 구조가 필요하다. 설계 전제가 달라 상용 서비스의 이식으로 성립하지 않는다.</w:t>
+              <w:t xml:space="preserve">민간 집단급식 분야에도 권장 식수를 제시하는 예측 서비스가 존재한다(업계 일반 동향으로 서술하며 개별 제품의 1차 출처는 확인하지 못함 — 근거 미확보). 민간에서는 결식과 잔반의 손실이 모두 화폐로 환산되므로 기대비용 최소화가 성립한다. 군에서는 결식이 지휘 책임 사안이어서 화폐 환산이 어렵고, 이 비대칭 때문에 비용을 추정하는 대신 허용 위험을 선언하는 구조가 필요하다. 설계 전제가 달라 상용 서비스의 이식으로는 성립하지 않는다.</w:t>
             </w:r>
           </w:p>
           <w:p>
@@ -2849,7 +2756,7 @@
           </w:p>
           <w:p>
             <w:pPr>
-              <w:spacing w:after="0" w:before="0" w:line="252"/>
+              <w:spacing w:after="30" w:before="0" w:line="252"/>
               <w:jc w:val="both"/>
             </w:pPr>
             <w:r>
@@ -3096,7 +3003,7 @@
           </w:p>
           <w:p>
             <w:pPr>
-              <w:spacing w:after="0" w:before="0" w:line="252"/>
+              <w:spacing w:after="30" w:before="0" w:line="252"/>
               <w:jc w:val="both"/>
             </w:pPr>
             <w:r>
@@ -3265,7 +3172,7 @@
                 <w:sz w:val="22"/>
                 <w:szCs w:val="22"/>
               </w:rPr>
-              <w:t xml:space="preserve">· 감축 여력의 상한 — 2020년 기준 장병 1인당 배출량은 182kg으로 같은 해 국민 1인당 100kg의 약 1.8배로 보고된다(출처 6). 다만 군은 1일 3식 전량을 단체급식으로 제공하는 반면 민간 통계의 산정 범위는 이와 달라, 이 격차 전부가 낭비는 아니며 격차를 그대로 감축 목표로 환산해서는 안 된다. 본 제안은 격차의 일부만을 회수 대상으로 본다.</w:t>
+              <w:t xml:space="preserve">· 감축 여력의 상한 — 2020년 기준 장병 1인당 배출량은 182kg으로 같은 해 국민 1인당 100kg의 약 1.8배다(출처 6). 다만 군은 1일 3식 전량을 단체급식으로 제공해 민간 통계와 산정 범위가 달라 격차 전부가 낭비는 아니며, 이를 그대로 감축 목표로 환산해서는 안 된다. 격차의 일부만을 회수 대상으로 본다.</w:t>
             </w:r>
           </w:p>
           <w:p>
@@ -3303,7 +3210,7 @@
                 <w:sz w:val="22"/>
                 <w:szCs w:val="22"/>
               </w:rPr>
-              <w:t xml:space="preserve">· 식자재비 절감 — 감축된 잔반에 대응하는 식자재비 절감은 처리비 절감보다 클 것으로 예상되나, 조리 투입 중량 대비 배출 중량 비율에 관한 공식 통계를 확인하지 못했다(근거 미확보). 금액으로 계상하지 않고 시범운용의 실측 항목으로 둔다. 참고로 2026년 기본급식비는 1인 1일 14,000원이다(출처 7).</w:t>
+              <w:t xml:space="preserve">· 식자재비 절감 — 감축 잔반에 대응하는 식자재비 절감은 처리비 절감보다 클 것으로 예상되나 조리 투입 대비 배출 중량 비율의 공식 통계를 확인하지 못해(근거 미확보) 금액으로 계상하지 않고 시범운용 실측 항목으로 둔다.</w:t>
             </w:r>
           </w:p>
           <w:p>
@@ -3322,7 +3229,7 @@
                 <w:sz w:val="22"/>
                 <w:szCs w:val="22"/>
               </w:rPr>
-              <w:t xml:space="preserve">· 중복 계상 방지 — 자동 청구 체계의 효과는 집계·점추정 정확도 향상 경로에서, 본 제안의 효과는 위험 수준을 반영한 취사량 결정 경로에서 발생한다. 시범운용에서 두 체계 도입 부대와 미도입 부대를 구분해 각각 실측하고 합산하지 않는다.</w:t>
+              <w:t xml:space="preserve">· 중복 계상 방지 — 자동 청구 체계의 효과는 집계·점추정 정확도 경로에서, 본 제안의 효과는 위험 수준을 반영한 취사량 결정 경로에서 발생한다. 시범운용에서 두 체계 도입 부대와 미도입 부대를 구분해 각각 실측하고 합산하지 않는다.</w:t>
             </w:r>
           </w:p>
           <w:p>
@@ -3378,26 +3285,7 @@
                 <w:sz w:val="22"/>
                 <w:szCs w:val="22"/>
               </w:rPr>
-              <w:t xml:space="preserve">② 급양 담당자의 판단 부담과 조리 인력의 과잉 조리 부담 완화, 잔반 운반·처리에 투입되는 병력 시간 절감. 절감된 시간은 훈련·정비 시간으로 환원된다.</w:t>
-            </w:r>
-          </w:p>
-          <w:p>
-            <w:pPr>
-              <w:spacing w:after="0" w:before="0" w:line="252"/>
-              <w:ind w:left="200" w:hanging="170"/>
-              <w:jc w:val="both"/>
-            </w:pPr>
-            <w:r>
-              <w:rPr>
-                <w:rFonts w:ascii="맑은 고딕" w:cs="맑은 고딕" w:eastAsia="맑은 고딕" w:hAnsi="맑은 고딕"/>
-                <w:b w:val="false"/>
-                <w:bCs w:val="false"/>
-                <w:i w:val="false"/>
-                <w:iCs w:val="false"/>
-                <w:sz w:val="22"/>
-                <w:szCs w:val="22"/>
-              </w:rPr>
-              <w:t xml:space="preserve">③ 부대별 예측 정확도와 편차 원인 데이터가 축적되어 급양 정책 수립의 근거 자산이 된다.</w:t>
+              <w:t xml:space="preserve">② 담당자의 판단 부담과 조리 인력의 과잉 조리 부담 완화, 잔반 운반·처리 병력 시간 절감. 절감된 시간은 훈련·정비 시간으로 환원된다. ③ 부대별 예측 정확도와 편차 원인 데이터가 축적되어 급양 정책의 근거 자산이 된다.</w:t>
             </w:r>
           </w:p>
         </w:tc>
@@ -3592,7 +3480,7 @@
                 <w:sz w:val="22"/>
                 <w:szCs w:val="22"/>
               </w:rPr>
-              <w:t xml:space="preserve">· 라벨 부재 — 3단 라벨 전략으로 대응하며 최소 요구 조건은 4~8주 잔반 중량 계측이다.</w:t>
+              <w:t xml:space="preserve">· 라벨 부재 — 3단 라벨 전략으로 대응하며 최소 요구 조건은 4~8주 잔반 중량 계측이다. 부대별 데이터 형식 상이는 변수 정의서를 선배포하고 최소 필수 변수 집합을 규정해 해소한다.</w:t>
             </w:r>
           </w:p>
           <w:p>
@@ -3611,7 +3499,7 @@
                 <w:sz w:val="22"/>
                 <w:szCs w:val="22"/>
               </w:rPr>
-              <w:t xml:space="preserve">· 부대별 데이터 형식 상이 — 변수 정의서를 선배포하고 최소 필수 변수 집합을 규정한다.</w:t>
+              <w:t xml:space="preserve">· 특이일 예측 실패 — 대규모 훈련·재해·상황 발생 시 불확실성 구간을 확대 표시하고 담당자 수동 모드로 자동 전환한다.</w:t>
             </w:r>
           </w:p>
           <w:p>
@@ -3630,7 +3518,7 @@
                 <w:sz w:val="22"/>
                 <w:szCs w:val="22"/>
               </w:rPr>
-              <w:t xml:space="preserve">· 특이일 예측 실패 — 대규모 훈련·재해·상황 발생 시 불확실성 구간을 확대 표시하고 담당자 수동 모드로 자동 전환한다.</w:t>
+              <w:t xml:space="preserve">· 담당자 수용성 — 최종 결정권 보장, 예측 적중 이력의 투명 공개, 권고 수정 시 불이익 없음을 운영 규칙으로 명문화한다.</w:t>
             </w:r>
           </w:p>
           <w:p>
@@ -3649,45 +3537,7 @@
                 <w:sz w:val="22"/>
                 <w:szCs w:val="22"/>
               </w:rPr>
-              <w:t xml:space="preserve">· 담당자 수용성 — 최종 결정권 보장, 예측 적중 이력의 투명 공개, 권고 수정 시 불이익 없음을 운영 규칙으로 명문화한다.</w:t>
-            </w:r>
-          </w:p>
-          <w:p>
-            <w:pPr>
-              <w:spacing w:after="15" w:before="0" w:line="252"/>
-              <w:ind w:left="200" w:hanging="170"/>
-              <w:jc w:val="both"/>
-            </w:pPr>
-            <w:r>
-              <w:rPr>
-                <w:rFonts w:ascii="맑은 고딕" w:cs="맑은 고딕" w:eastAsia="맑은 고딕" w:hAnsi="맑은 고딕"/>
-                <w:b w:val="false"/>
-                <w:bCs w:val="false"/>
-                <w:i w:val="false"/>
-                <w:iCs w:val="false"/>
-                <w:sz w:val="22"/>
-                <w:szCs w:val="22"/>
-              </w:rPr>
-              <w:t xml:space="preserve">· 기존 체계와의 기능 중복 오인 — 점추정 개선과 위험 수준 통제의 기능 경계를 서면·발표 모두에서 명시적으로 구분해 설명한다.</w:t>
-            </w:r>
-          </w:p>
-          <w:p>
-            <w:pPr>
-              <w:spacing w:after="0" w:before="0" w:line="252"/>
-              <w:ind w:left="200" w:hanging="170"/>
-              <w:jc w:val="both"/>
-            </w:pPr>
-            <w:r>
-              <w:rPr>
-                <w:rFonts w:ascii="맑은 고딕" w:cs="맑은 고딕" w:eastAsia="맑은 고딕" w:hAnsi="맑은 고딕"/>
-                <w:b w:val="false"/>
-                <w:bCs w:val="false"/>
-                <w:i w:val="false"/>
-                <w:iCs w:val="false"/>
-                <w:sz w:val="22"/>
-                <w:szCs w:val="22"/>
-              </w:rPr>
-              <w:t xml:space="preserve">· 유지보수 부담 — 부대에 별도 인력을 두지 않고 중앙에서 모델을 관리·배포하며, 부대는 실적 입력과 승인만 수행한다.</w:t>
+              <w:t xml:space="preserve">· 기능 중복 오인은 점추정 개선과 위험 통제의 경계를 명시해 대응하고, 유지보수는 중앙에서 모델을 관리·배포해 부대에 별도 인력을 두지 않는다.</w:t>
             </w:r>
           </w:p>
         </w:tc>
@@ -3774,200 +3624,59 @@
           </w:p>
           <w:p>
             <w:pPr>
-              <w:spacing w:after="8" w:before="0" w:line="252"/>
-              <w:jc w:val="both"/>
-            </w:pPr>
-            <w:r>
-              <w:rPr>
-                <w:rFonts w:ascii="맑은 고딕" w:cs="맑은 고딕" w:eastAsia="맑은 고딕" w:hAnsi="맑은 고딕"/>
-                <w:b w:val="false"/>
-                <w:bCs w:val="false"/>
-                <w:i w:val="false"/>
-                <w:iCs w:val="false"/>
-                <w:sz w:val="22"/>
-                <w:szCs w:val="22"/>
-              </w:rPr>
-              <w:t xml:space="preserve">[국방망 기존 데이터] 신고 식수 · 출타 집계 · 훈련일정 · 메뉴 · (자동 청구 체계 산출값)</w:t>
-            </w:r>
-          </w:p>
-          <w:p>
-            <w:pPr>
-              <w:spacing w:after="8" w:before="0" w:line="252"/>
-              <w:jc w:val="both"/>
-            </w:pPr>
-            <w:r>
-              <w:rPr>
-                <w:rFonts w:ascii="맑은 고딕" w:cs="맑은 고딕" w:eastAsia="맑은 고딕" w:hAnsi="맑은 고딕"/>
-                <w:b w:val="false"/>
-                <w:bCs w:val="false"/>
-                <w:i w:val="false"/>
-                <w:iCs w:val="false"/>
-                <w:sz w:val="22"/>
-                <w:szCs w:val="22"/>
-              </w:rPr>
-              <w:t xml:space="preserve">     ↓</w:t>
-            </w:r>
-          </w:p>
-          <w:p>
-            <w:pPr>
-              <w:spacing w:after="8" w:before="0" w:line="252"/>
-              <w:jc w:val="both"/>
-            </w:pPr>
-            <w:r>
-              <w:rPr>
-                <w:rFonts w:ascii="맑은 고딕" w:cs="맑은 고딕" w:eastAsia="맑은 고딕" w:hAnsi="맑은 고딕"/>
-                <w:b w:val="false"/>
-                <w:bCs w:val="false"/>
-                <w:i w:val="false"/>
-                <w:iCs w:val="false"/>
-                <w:sz w:val="22"/>
-                <w:szCs w:val="22"/>
-              </w:rPr>
-              <w:t xml:space="preserve">[예측 계층] 편차(신고값 − 실취식) 분위수 학습 → 편차 확률분포 산출</w:t>
-            </w:r>
-          </w:p>
-          <w:p>
-            <w:pPr>
-              <w:spacing w:after="8" w:before="0" w:line="252"/>
-              <w:jc w:val="both"/>
-            </w:pPr>
-            <w:r>
-              <w:rPr>
-                <w:rFonts w:ascii="맑은 고딕" w:cs="맑은 고딕" w:eastAsia="맑은 고딕" w:hAnsi="맑은 고딕"/>
-                <w:b w:val="false"/>
-                <w:bCs w:val="false"/>
-                <w:i w:val="false"/>
-                <w:iCs w:val="false"/>
-                <w:sz w:val="22"/>
-                <w:szCs w:val="22"/>
-              </w:rPr>
-              <w:t xml:space="preserve">     ↓</w:t>
-            </w:r>
-          </w:p>
-          <w:p>
-            <w:pPr>
-              <w:spacing w:after="8" w:before="0" w:line="252"/>
-              <w:jc w:val="both"/>
-            </w:pPr>
-            <w:r>
-              <w:rPr>
-                <w:rFonts w:ascii="맑은 고딕" w:cs="맑은 고딕" w:eastAsia="맑은 고딕" w:hAnsi="맑은 고딕"/>
-                <w:b w:val="false"/>
-                <w:bCs w:val="false"/>
-                <w:i w:val="false"/>
-                <w:iCs w:val="false"/>
-                <w:sz w:val="22"/>
-                <w:szCs w:val="22"/>
-              </w:rPr>
-              <w:t xml:space="preserve">[결정 계층] 지휘관 설정 결식 허용확률 α → 서비스수준 τ = 1 − α → τ분위 권고 취사량 + 함의 Cu/Co 표시</w:t>
-            </w:r>
-          </w:p>
-          <w:p>
-            <w:pPr>
-              <w:spacing w:after="8" w:before="0" w:line="252"/>
-              <w:jc w:val="both"/>
-            </w:pPr>
-            <w:r>
-              <w:rPr>
-                <w:rFonts w:ascii="맑은 고딕" w:cs="맑은 고딕" w:eastAsia="맑은 고딕" w:hAnsi="맑은 고딕"/>
-                <w:b w:val="false"/>
-                <w:bCs w:val="false"/>
-                <w:i w:val="false"/>
-                <w:iCs w:val="false"/>
-                <w:sz w:val="22"/>
-                <w:szCs w:val="22"/>
-              </w:rPr>
-              <w:t xml:space="preserve">     ↓</w:t>
-            </w:r>
-          </w:p>
-          <w:p>
-            <w:pPr>
-              <w:spacing w:after="8" w:before="0" w:line="252"/>
-              <w:jc w:val="both"/>
-            </w:pPr>
-            <w:r>
-              <w:rPr>
-                <w:rFonts w:ascii="맑은 고딕" w:cs="맑은 고딕" w:eastAsia="맑은 고딕" w:hAnsi="맑은 고딕"/>
-                <w:b w:val="false"/>
-                <w:bCs w:val="false"/>
-                <w:i w:val="false"/>
-                <w:iCs w:val="false"/>
-                <w:sz w:val="22"/>
-                <w:szCs w:val="22"/>
-              </w:rPr>
-              <w:t xml:space="preserve">[권고 화면] 권고 취사량 · 불확실성 구간 · 산출 근거 → 담당자 확인 · 수정 · 승인</w:t>
-            </w:r>
-          </w:p>
-          <w:p>
-            <w:pPr>
-              <w:spacing w:after="8" w:before="0" w:line="252"/>
-              <w:jc w:val="both"/>
-            </w:pPr>
-            <w:r>
-              <w:rPr>
-                <w:rFonts w:ascii="맑은 고딕" w:cs="맑은 고딕" w:eastAsia="맑은 고딕" w:hAnsi="맑은 고딕"/>
-                <w:b w:val="false"/>
-                <w:bCs w:val="false"/>
-                <w:i w:val="false"/>
-                <w:iCs w:val="false"/>
-                <w:sz w:val="22"/>
-                <w:szCs w:val="22"/>
-              </w:rPr>
-              <w:t xml:space="preserve">     ↓</w:t>
-            </w:r>
-          </w:p>
-          <w:p>
-            <w:pPr>
-              <w:spacing w:after="8" w:before="0" w:line="252"/>
-              <w:jc w:val="both"/>
-            </w:pPr>
-            <w:r>
-              <w:rPr>
-                <w:rFonts w:ascii="맑은 고딕" w:cs="맑은 고딕" w:eastAsia="맑은 고딕" w:hAnsi="맑은 고딕"/>
-                <w:b w:val="false"/>
-                <w:bCs w:val="false"/>
-                <w:i w:val="false"/>
-                <w:iCs w:val="false"/>
-                <w:sz w:val="22"/>
-                <w:szCs w:val="22"/>
-              </w:rPr>
-              <w:t xml:space="preserve">[실행] 취사 및 식자재 불출 (자동 청구 체계 연동)</w:t>
-            </w:r>
-          </w:p>
-          <w:p>
-            <w:pPr>
-              <w:spacing w:after="8" w:before="0" w:line="252"/>
-              <w:jc w:val="both"/>
-            </w:pPr>
-            <w:r>
-              <w:rPr>
-                <w:rFonts w:ascii="맑은 고딕" w:cs="맑은 고딕" w:eastAsia="맑은 고딕" w:hAnsi="맑은 고딕"/>
-                <w:b w:val="false"/>
-                <w:bCs w:val="false"/>
-                <w:i w:val="false"/>
-                <w:iCs w:val="false"/>
-                <w:sz w:val="22"/>
-                <w:szCs w:val="22"/>
-              </w:rPr>
-              <w:t xml:space="preserve">     ↓</w:t>
-            </w:r>
-          </w:p>
-          <w:p>
-            <w:pPr>
-              <w:spacing w:after="40" w:before="0" w:line="252"/>
-              <w:jc w:val="both"/>
-            </w:pPr>
-            <w:r>
-              <w:rPr>
-                <w:rFonts w:ascii="맑은 고딕" w:cs="맑은 고딕" w:eastAsia="맑은 고딕" w:hAnsi="맑은 고딕"/>
-                <w:b w:val="false"/>
-                <w:bCs w:val="false"/>
-                <w:i w:val="false"/>
-                <w:iCs w:val="false"/>
-                <w:sz w:val="22"/>
-                <w:szCs w:val="22"/>
-              </w:rPr>
-              <w:t xml:space="preserve">[환류] 당일 실적 · 잔반 계측 → 예측오차 기록 → 주간 재학습 → 지휘부 대시보드(결식률 · 서비스수준 달성도 · 잔반 추이)</w:t>
+              <w:spacing w:after="15" w:before="0" w:line="252"/>
+              <w:ind w:left="200" w:hanging="170"/>
+              <w:jc w:val="both"/>
+            </w:pPr>
+            <w:r>
+              <w:rPr>
+                <w:rFonts w:ascii="맑은 고딕" w:cs="맑은 고딕" w:eastAsia="맑은 고딕" w:hAnsi="맑은 고딕"/>
+                <w:b w:val="false"/>
+                <w:bCs w:val="false"/>
+                <w:i w:val="false"/>
+                <w:iCs w:val="false"/>
+                <w:sz w:val="22"/>
+                <w:szCs w:val="22"/>
+              </w:rPr>
+              <w:t xml:space="preserve">[국방망 기존 데이터] 신고 식수 · 출타 집계 · 훈련일정 · 메뉴 · (자동 청구 체계 산출값) → [예측 계층] 편차(신고값 − 실취식) 분위수 학습 → 편차 확률분포 산출</w:t>
+            </w:r>
+          </w:p>
+          <w:p>
+            <w:pPr>
+              <w:spacing w:after="15" w:before="0" w:line="252"/>
+              <w:ind w:left="200" w:hanging="170"/>
+              <w:jc w:val="both"/>
+            </w:pPr>
+            <w:r>
+              <w:rPr>
+                <w:rFonts w:ascii="맑은 고딕" w:cs="맑은 고딕" w:eastAsia="맑은 고딕" w:hAnsi="맑은 고딕"/>
+                <w:b w:val="false"/>
+                <w:bCs w:val="false"/>
+                <w:i w:val="false"/>
+                <w:iCs w:val="false"/>
+                <w:sz w:val="22"/>
+                <w:szCs w:val="22"/>
+              </w:rPr>
+              <w:t xml:space="preserve">→ [결정 계층] 지휘관 설정 결식 허용확률 α → 서비스수준 τ = 1 − α → τ분위 권고 취사량 및 함의 Cu/Co 표시 → [권고 화면] 권고량 · 불확실성 구간 · 산출 근거 → 담당자 확인 · 수정 · 승인</w:t>
+            </w:r>
+          </w:p>
+          <w:p>
+            <w:pPr>
+              <w:spacing w:after="15" w:before="0" w:line="252"/>
+              <w:ind w:left="200" w:hanging="170"/>
+              <w:jc w:val="both"/>
+            </w:pPr>
+            <w:r>
+              <w:rPr>
+                <w:rFonts w:ascii="맑은 고딕" w:cs="맑은 고딕" w:eastAsia="맑은 고딕" w:hAnsi="맑은 고딕"/>
+                <w:b w:val="false"/>
+                <w:bCs w:val="false"/>
+                <w:i w:val="false"/>
+                <w:iCs w:val="false"/>
+                <w:sz w:val="22"/>
+                <w:szCs w:val="22"/>
+              </w:rPr>
+              <w:t xml:space="preserve">→ [실행] 취사 및 식자재 불출(자동 청구 체계 연동) → [환류] 당일 실적 · 잔반 계측 → 예측오차 기록 → 주간 재학습 → 지휘부 대시보드(결식률 · 서비스수준 달성도 · 잔반 추이)</w:t>
             </w:r>
           </w:p>
           <w:p>
@@ -4026,8 +3735,8 @@
           </w:p>
           <w:p>
             <w:pPr>
-              <w:spacing w:after="10" w:before="0" w:line="236"/>
-              <w:ind w:left="250" w:hanging="250"/>
+              <w:spacing w:after="15" w:before="0" w:line="252"/>
+              <w:ind w:left="200" w:hanging="170"/>
               <w:jc w:val="left"/>
             </w:pPr>
             <w:r>
@@ -4045,8 +3754,27 @@
           </w:p>
           <w:p>
             <w:pPr>
-              <w:spacing w:after="10" w:before="0" w:line="236"/>
-              <w:ind w:left="250" w:hanging="250"/>
+              <w:spacing w:after="15" w:before="0" w:line="252"/>
+              <w:ind w:left="200" w:hanging="170"/>
+              <w:jc w:val="both"/>
+            </w:pPr>
+            <w:r>
+              <w:rPr>
+                <w:rFonts w:ascii="맑은 고딕" w:cs="맑은 고딕" w:eastAsia="맑은 고딕" w:hAnsi="맑은 고딕"/>
+                <w:b w:val="false"/>
+                <w:bCs w:val="false"/>
+                <w:i w:val="false"/>
+                <w:iCs w:val="false"/>
+                <w:sz w:val="22"/>
+                <w:szCs w:val="22"/>
+              </w:rPr>
+              <w:t xml:space="preserve">2. 정영한·이동규(2024), 효율적인 집단식사 서비스 제공을 위한 공공기관 구내식당 실데이터 기반의 식수 예측 기계학습 모델연구, 정보과학회 컴퓨팅의 실제 논문지(2024.4).</w:t>
+            </w:r>
+          </w:p>
+          <w:p>
+            <w:pPr>
+              <w:spacing w:after="15" w:before="0" w:line="252"/>
+              <w:ind w:left="200" w:hanging="170"/>
               <w:jc w:val="left"/>
             </w:pPr>
             <w:r>
@@ -4059,13 +3787,13 @@
                 <w:sz w:val="22"/>
                 <w:szCs w:val="22"/>
               </w:rPr>
-              <w:t xml:space="preserve">2. 정영한·이동규(2024), 효율적인 집단식사 서비스 제공을 위한 공공기관 구내식당 실데이터 기반의 식수 예측 기계학습 모델연구, 정보과학회 컴퓨팅의 실제 논문지(2024.4).</w:t>
-            </w:r>
-          </w:p>
-          <w:p>
-            <w:pPr>
-              <w:spacing w:after="10" w:before="0" w:line="236"/>
-              <w:ind w:left="250" w:hanging="250"/>
+              <w:t xml:space="preserve">3. Arrow, K. J., Harris, T. &amp; Marschak, J.(1951), Optimal Inventory Policy, Econometrica 19(3), 250-272. DOI: 10.2307/1906813 — 임계분위 공식은 이 논문의 직접 표현이 아니라 후속 연구에서 정식화된 표준 결과다.</w:t>
+            </w:r>
+          </w:p>
+          <w:p>
+            <w:pPr>
+              <w:spacing w:after="15" w:before="0" w:line="252"/>
+              <w:ind w:left="200" w:hanging="170"/>
               <w:jc w:val="left"/>
             </w:pPr>
             <w:r>
@@ -4078,13 +3806,13 @@
                 <w:sz w:val="22"/>
                 <w:szCs w:val="22"/>
               </w:rPr>
-              <w:t xml:space="preserve">3. Arrow, K. J., Harris, T. &amp; Marschak, J.(1951), Optimal Inventory Policy, Econometrica 19(3), 250-272. DOI: 10.2307/1906813 — 재고이론 계보의 원전이며, 임계분위 공식은 이 논문의 직접 표현이 아니라 후속 연구에서 정식화된 표준 결과다.</w:t>
-            </w:r>
-          </w:p>
-          <w:p>
-            <w:pPr>
-              <w:spacing w:after="10" w:before="0" w:line="236"/>
-              <w:ind w:left="250" w:hanging="250"/>
+              <w:t xml:space="preserve">4. Ban, G.-Y. &amp; Rudin, C.(2019), The Big Data Newsvendor: Practical Insights from Machine Learning, Operations Research 67(1), 90-108. DOI: 10.1287/opre.2018.1757</w:t>
+            </w:r>
+          </w:p>
+          <w:p>
+            <w:pPr>
+              <w:spacing w:after="15" w:before="0" w:line="252"/>
+              <w:ind w:left="200" w:hanging="170"/>
               <w:jc w:val="left"/>
             </w:pPr>
             <w:r>
@@ -4097,13 +3825,13 @@
                 <w:sz w:val="22"/>
                 <w:szCs w:val="22"/>
               </w:rPr>
-              <w:t xml:space="preserve">4. Ban, G.-Y. &amp; Rudin, C.(2019), The Big Data Newsvendor: Practical Insights from Machine Learning, Operations Research 67(1), 90-108. DOI: 10.1287/opre.2018.1757</w:t>
-            </w:r>
-          </w:p>
-          <w:p>
-            <w:pPr>
-              <w:spacing w:after="10" w:before="0" w:line="236"/>
-              <w:ind w:left="250" w:hanging="250"/>
+              <w:t xml:space="preserve">5. 군 음식물 쓰레기 처리비용 2018년 약 103억 원 → 2023년 약 195억 원: 국방부가 기획재정부에 제시한 자료를 인용한 보도. 한국경제(2024.10.3). https://www.hankyung.com/article/2024100330467 — 정부 공개 원문은 확인하지 못함(근거 미확보).</w:t>
+            </w:r>
+          </w:p>
+          <w:p>
+            <w:pPr>
+              <w:spacing w:after="15" w:before="0" w:line="252"/>
+              <w:ind w:left="200" w:hanging="170"/>
               <w:jc w:val="left"/>
             </w:pPr>
             <w:r>
@@ -4116,13 +3844,13 @@
                 <w:sz w:val="22"/>
                 <w:szCs w:val="22"/>
               </w:rPr>
-              <w:t xml:space="preserve">5. 군 음식물 쓰레기 처리비용 2018년 약 103억 원 → 2023년 약 195억 원: 국방부가 기획재정부에 제시한 자료를 인용한 보도. 한국경제(2024.10.3). https://www.hankyung.com/article/2024100330467 — 정부 공개 원문은 확인하지 못함(근거 미확보).</w:t>
-            </w:r>
-          </w:p>
-          <w:p>
-            <w:pPr>
-              <w:spacing w:after="10" w:before="0" w:line="236"/>
-              <w:ind w:left="250" w:hanging="250"/>
+              <w:t xml:space="preserve">6. 장병 1인당 배출량 2017년 125kg → 2021년 195kg, 2020년 기준 장병 182kg 대 국민 100kg: 국정감사 국방부 제출자료(의원실 공개) 인용 보도. 내외통신. http://www.nwtnews.co.kr/news/articleView.html?idxno=99636 — 원자료는 확인하지 못함(근거 미확보).</w:t>
+            </w:r>
+          </w:p>
+          <w:p>
+            <w:pPr>
+              <w:spacing w:after="15" w:before="0" w:line="252"/>
+              <w:ind w:left="200" w:hanging="170"/>
               <w:jc w:val="left"/>
             </w:pPr>
             <w:r>
@@ -4135,13 +3863,13 @@
                 <w:sz w:val="22"/>
                 <w:szCs w:val="22"/>
               </w:rPr>
-              <w:t xml:space="preserve">6. 장병 1인당 연간 음식물류폐기물 배출량 2017년 125kg → 2021년 195kg, 2020년 기준 장병 182kg 대 국민 100kg: 국정감사 국방부 제출자료(의원실 공개)를 인용한 보도. 내외통신. http://www.nwtnews.co.kr/news/articleView.html?idxno=99636 — 원자료 및 국민 1인당 배출량의 환경부 원 통계는 확인하지 못함(근거 미확보).</w:t>
-            </w:r>
-          </w:p>
-          <w:p>
-            <w:pPr>
-              <w:spacing w:after="10" w:before="0" w:line="236"/>
-              <w:ind w:left="250" w:hanging="250"/>
+              <w:t xml:space="preserve">7. 2026년 장병 기본급식비 1인 1일 13,000원 → 14,000원: 「2026년 국방예산 확정」 보도자료, 대한민국 정책브리핑(2025.12). https://www.korea.kr/briefing/pressReleaseView.do?newsId=156733517</w:t>
+            </w:r>
+          </w:p>
+          <w:p>
+            <w:pPr>
+              <w:spacing w:after="15" w:before="0" w:line="252"/>
+              <w:ind w:left="200" w:hanging="170"/>
               <w:jc w:val="left"/>
             </w:pPr>
             <w:r>
@@ -4154,26 +3882,7 @@
                 <w:sz w:val="22"/>
                 <w:szCs w:val="22"/>
               </w:rPr>
-              <w:t xml:space="preserve">7. 2026년 장병 기본급식비 1인 1일 13,000원 → 14,000원: 「2026년 국방예산 확정」 보도자료, 대한민국 정책브리핑(2025.12). https://www.korea.kr/briefing/pressReleaseView.do?newsId=156733517</w:t>
-            </w:r>
-          </w:p>
-          <w:p>
-            <w:pPr>
-              <w:spacing w:after="10" w:before="0" w:line="236"/>
-              <w:ind w:left="250" w:hanging="250"/>
-              <w:jc w:val="left"/>
-            </w:pPr>
-            <w:r>
-              <w:rPr>
-                <w:rFonts w:ascii="맑은 고딕" w:cs="맑은 고딕" w:eastAsia="맑은 고딕" w:hAnsi="맑은 고딕"/>
-                <w:b w:val="false"/>
-                <w:bCs w:val="false"/>
-                <w:i w:val="false"/>
-                <w:iCs w:val="false"/>
-                <w:sz w:val="22"/>
-                <w:szCs w:val="22"/>
-              </w:rPr>
-              <w:t xml:space="preserve">8. 군 일부 제대의 급식 자동 청구 체계 도입 및 운용 목적(식수 인원 파악·적정 식재료량 예측): 한국일보(2026.6.14). https://www.hankookilbo.com/news/article/A2026061412380005044 — 언론보도 기준이며 군 공식 검증자료가 아님(불확실). 부대 식별정보는 본 제안서에서 생략함.</w:t>
+              <w:t xml:space="preserve">8. 군 일부 제대의 급식 자동 청구 체계 도입 및 운용 목적(식수 인원 파악·적정 식재료량 예측): 한국일보(2026.6.14). https://www.hankookilbo.com/news/article/A2026061412380005044 — 언론보도 기준이며 군 공식 검증자료가 아님(불확실).</w:t>
             </w:r>
           </w:p>
         </w:tc>

</xml_diff>

<commit_message>
fix(defense-ai-idea-contest): 표 잘림 유발하던 비표준 sectPr 을 Word 표준 형식으로 재작성
LibreOffice 가 .doc -> .docx 변환 시 생성한 pgMar 의 속성 순서가 스키마
순서(top,right,bottom,left,header,footer,gutter)와 달라 엄격한 임포터가
용지 설정을 무시하고 기본 여백 30mm 를 적용, 표(16.77cm)가 본문폭(15cm)을
1.77cm 초과해 잘리는 현상 발생

- pgMar 속성을 스키마 순서로 재배열, pgSz 에 orient 명시, cols 추가
- 여백값 자체는 원본과 동일(좌우 1134, 위아래 851 twips)
- 재검증: 대상 외 셀 54개 XML 동일, tblGrid/tblPr/styles/fontTable 전부 동일
- 렌더 실측 좌여백 23.0mm / 우여백 22.9mm 로 좌우 대칭 확인
</commit_message>
<xml_diff>
--- a/defense-ai-idea-contest/2026년 제3차 국방AI 활용 아이디어 경연대회_공모기획서.docx
+++ b/defense-ai-idea-contest/2026년 제3차 국방AI 활용 아이디어 경연대회_공모기획서.docx
@@ -5376,11 +5376,9 @@
     </w:p>
     <w:sectPr>
       <w:type w:val="nextPage"/>
-      <w:pgSz w:w="11906" w:h="16838"/>
-      <w:pgMar w:left="1134" w:right="1134" w:gutter="0" w:header="0" w:top="851" w:footer="0" w:bottom="851"/>
-      <w:pgNumType w:fmt="decimal"/>
-      <w:formProt w:val="false"/>
-      <w:textDirection w:val="lrTb"/>
+      <w:pgSz w:w="11906" w:h="16838" w:orient="portrait"/>
+      <w:pgMar w:top="851" w:right="1134" w:bottom="851" w:left="1134" w:header="425" w:footer="425" w:gutter="0"/>
+      <w:cols w:space="425" w:num="1"/>
       <w:docGrid w:type="default" w:linePitch="299" w:charSpace="0"/>
     </w:sectPr>
   </w:body>

</xml_diff>